<commit_message>
fix: filter trunk to placement-only moves; drop families with corrupted trunks
winning_lines stores single-player move sequences. When replayed on an
alternating-turn board, slide moves (from-to notation) in the prefix get
attributed to the wrong side, corrupting board reconstruction.

Fix: only count games where all 8 prefix moves are placements (no '-' in
the notation) when voting for the trunk. Families with fewer than 2 such
games are skipped and replaced by the next eligible family. All 11 family
trunks now produce exactly 4W+4B pieces.

Regenerate both docs with clean boards.

Co-Authored-By: Claude Sonnet 4.6 <noreply@anthropic.com>
</commit_message>
<xml_diff>
--- a/docs/ai_opening_continuations_illustrated.docx
+++ b/docs/ai_opening_continuations_illustrated.docx
@@ -655,7 +655,7 @@
           <w:b w:val="0"/>
           <w:sz w:val="18"/>
         </w:rPr>
-        <w:t>★ = Generalist v4 · DB: 353 games</w:t>
+        <w:t>★ = Generalist v4 · DB: 354 games</w:t>
       </w:r>
     </w:p>
     <w:p/>
@@ -1859,7 +1859,7 @@
           <w:b w:val="0"/>
           <w:sz w:val="18"/>
         </w:rPr>
-        <w:t>★ = Generalist v4 · DB: 258 games</w:t>
+        <w:t>★ = Generalist v4 · DB: 260 games</w:t>
       </w:r>
     </w:p>
     <w:p/>
@@ -3048,13 +3048,13 @@
           <w:b w:val="0"/>
           <w:sz w:val="18"/>
         </w:rPr>
-        <w:t>Trunk (8-ply):  W1:c4  B1:d3</w:t>
+        <w:t>Trunk (8-ply):  W1:d3  B1:e4</w:t>
         <w:br/>
-        <w:t>W2:d3-e3  B2:f2-d2</w:t>
+        <w:t>W2:b4  B2:d6</w:t>
         <w:br/>
-        <w:t>W3:e3-e4  B3:e4-e5</w:t>
+        <w:t>W3:f4  B3:a1</w:t>
         <w:br/>
-        <w:t>W4:e5-e4  B4:d6-f6</w:t>
+        <w:t>W4:a4  B4:g7</w:t>
       </w:r>
     </w:p>
     <w:p>
@@ -3133,9 +3133,9 @@
               <w:rPr>
                 <w:sz w:val="16"/>
               </w:rPr>
-              <w:t>W5:f2  B5:f4</w:t>
+              <w:t>W5:c4xe4  B5:d2</w:t>
               <w:br/>
-              <w:t>W6:d6  B6:b4</w:t>
+              <w:t>W6:d1  B6:d5</w:t>
               <w:br/>
               <w:t>★ gen v4</w:t>
             </w:r>
@@ -3194,9 +3194,9 @@
               <w:rPr>
                 <w:sz w:val="16"/>
               </w:rPr>
-              <w:t>W5:f2  B5:b4</w:t>
+              <w:t>W5:c4xe4  B5:e4</w:t>
               <w:br/>
-              <w:t>W6:g4  B6:f4</w:t>
+              <w:t>W6:d7  B6:d5</w:t>
               <w:br/>
               <w:t>★ gen v4</w:t>
             </w:r>
@@ -3255,9 +3255,9 @@
               <w:rPr>
                 <w:sz w:val="16"/>
               </w:rPr>
-              <w:t>W5:f2  B5:d3</w:t>
+              <w:t>W5:c4xe4  B5:d7</w:t>
               <w:br/>
-              <w:t>W6:d1  B6:f4</w:t>
+              <w:t>W6:d5  B6:a7xd5</w:t>
               <w:br/>
               <w:t>★ gen v4</w:t>
             </w:r>
@@ -3318,9 +3318,9 @@
               <w:rPr>
                 <w:sz w:val="16"/>
               </w:rPr>
-              <w:t>W5:d6  B5:b4</w:t>
+              <w:t>W5:c4xd6  B5:d6</w:t>
               <w:br/>
-              <w:t>W6:d5  B6:d7</w:t>
+              <w:t>W6:d7  B6:d5</w:t>
               <w:br/>
               <w:t>★ gen v4</w:t>
             </w:r>
@@ -3379,9 +3379,9 @@
               <w:rPr>
                 <w:sz w:val="16"/>
               </w:rPr>
-              <w:t>W5:d6  B5:f4</w:t>
+              <w:t>W5:c4xd6  B5:d2</w:t>
               <w:br/>
-              <w:t>W6:f2  B6:b4</w:t>
+              <w:t>W6:d6  B6:d5</w:t>
               <w:br/>
               <w:t>★ gen v4</w:t>
             </w:r>
@@ -3440,9 +3440,9 @@
               <w:rPr>
                 <w:sz w:val="16"/>
               </w:rPr>
-              <w:t>W5:d6  B5:d3</w:t>
+              <w:t>W5:c4xd6  B5:d7</w:t>
               <w:br/>
-              <w:t>W6:d1  B6:b4</w:t>
+              <w:t>W6:a7  B6:d5</w:t>
               <w:br/>
               <w:t>★ gen v4</w:t>
             </w:r>
@@ -3503,9 +3503,9 @@
               <w:rPr>
                 <w:sz w:val="16"/>
               </w:rPr>
-              <w:t>W5:f4  B5:g4</w:t>
+              <w:t>W5:c4xa1  B5:d5</w:t>
               <w:br/>
-              <w:t>W6:b4  B6:a4</w:t>
+              <w:t>W6:d7  B6:d2</w:t>
               <w:br/>
               <w:t>★ gen v4</w:t>
             </w:r>
@@ -3564,9 +3564,9 @@
               <w:rPr>
                 <w:sz w:val="16"/>
               </w:rPr>
-              <w:t>W5:f4  B5:d6</w:t>
+              <w:t>W5:c4xa1  B5:d7</w:t>
               <w:br/>
-              <w:t>W6:g4xd6  B6:d6</w:t>
+              <w:t>W6:d5  B6:a7xd5</w:t>
               <w:br/>
               <w:t>★ gen v4</w:t>
             </w:r>
@@ -3625,9 +3625,9 @@
               <w:rPr>
                 <w:sz w:val="16"/>
               </w:rPr>
-              <w:t>W5:f4  B5:d3</w:t>
+              <w:t>W5:c4xa1  B5:g4</w:t>
               <w:br/>
-              <w:t>W6:g4xd2  B6:d2</w:t>
+              <w:t>W6:g1  B6:d1</w:t>
               <w:br/>
               <w:t>★ gen v4</w:t>
             </w:r>
@@ -4869,7 +4869,7 @@
           <w:b w:val="0"/>
           <w:sz w:val="18"/>
         </w:rPr>
-        <w:t>★ = Generalist v4 · DB: 111 games</w:t>
+        <w:t>★ = Generalist v4 · DB: 112 games</w:t>
       </w:r>
     </w:p>
     <w:p/>

</xml_diff>